<commit_message>
Remove local file paths from the Word file and add a check for them
</commit_message>
<xml_diff>
--- a/deliverables/Overledger-Redbelly-Feasibility-Study.docx
+++ b/deliverables/Overledger-Redbelly-Feasibility-Study.docx
@@ -1776,7 +1776,7 @@
               <a:graphicData uri="http://schemas.openxmlformats.org/drawingml/2006/picture">
                 <pic:pic>
                   <pic:nvPicPr>
-                    <pic:cNvPr descr="/home/user/quant-redbelly-interoperability/build/diagrams/stack.png" id="47" name="Picture"/>
+                    <pic:cNvPr descr="stack.png" id="47" name="Picture"/>
                     <pic:cNvPicPr>
                       <a:picLocks noChangeArrowheads="1" noChangeAspect="1"/>
                     </pic:cNvPicPr>
@@ -2116,7 +2116,7 @@
               <a:graphicData uri="http://schemas.openxmlformats.org/drawingml/2006/picture">
                 <pic:pic>
                   <pic:nvPicPr>
-                    <pic:cNvPr descr="/home/user/quant-redbelly-interoperability/build/diagrams/routes.png" id="50" name="Picture"/>
+                    <pic:cNvPr descr="routes.png" id="50" name="Picture"/>
                     <pic:cNvPicPr>
                       <a:picLocks noChangeArrowheads="1" noChangeAspect="1"/>
                     </pic:cNvPicPr>
@@ -3874,7 +3874,7 @@
               <a:graphicData uri="http://schemas.openxmlformats.org/drawingml/2006/picture">
                 <pic:pic>
                   <pic:nvPicPr>
-                    <pic:cNvPr descr="/home/user/quant-redbelly-interoperability/build/diagrams/depths.png" id="74" name="Picture"/>
+                    <pic:cNvPr descr="depths.png" id="74" name="Picture"/>
                     <pic:cNvPicPr>
                       <a:picLocks noChangeArrowheads="1" noChangeAspect="1"/>
                     </pic:cNvPicPr>
@@ -4683,7 +4683,7 @@
               <a:graphicData uri="http://schemas.openxmlformats.org/drawingml/2006/picture">
                 <pic:pic>
                   <pic:nvPicPr>
-                    <pic:cNvPr descr="/home/user/quant-redbelly-interoperability/build/diagrams/journey.png" id="83" name="Picture"/>
+                    <pic:cNvPr descr="journey.png" id="83" name="Picture"/>
                     <pic:cNvPicPr>
                       <a:picLocks noChangeArrowheads="1" noChangeAspect="1"/>
                     </pic:cNvPicPr>

</xml_diff>